<commit_message>
Refine CV layout and sections
</commit_message>
<xml_diff>
--- a/assets/pdf/Qiao-Sun-CV.docx
+++ b/assets/pdf/Qiao-Sun-CV.docx
@@ -4,7 +4,7 @@
   <w:body>
     <w:p>
       <w:pPr>
-        <w:spacing w:after="0"/>
+        <w:spacing w:after="40" w:line="440" w:lineRule="exact"/>
         <w:jc w:val="center"/>
       </w:pPr>
       <w:r>
@@ -18,7 +18,7 @@
     </w:p>
     <w:p>
       <w:pPr>
-        <w:spacing w:after="100"/>
+        <w:spacing w:after="160" w:line="220" w:lineRule="exact"/>
         <w:jc w:val="center"/>
       </w:pPr>
       <w:r>
@@ -33,14 +33,14 @@
     </w:p>
     <w:p>
       <w:pPr>
-        <w:spacing w:before="140" w:after="20"/>
+        <w:spacing w:before="220" w:after="60" w:line="240" w:lineRule="exact"/>
       </w:pPr>
       <w:r>
         <w:rPr>
           <w:rFonts w:ascii="Arial" w:hAnsi="Arial"/>
           <w:b/>
           <w:color w:val="1F4E79"/>
-          <w:sz w:val="19"/>
+          <w:sz w:val="20"/>
         </w:rPr>
         <w:t>RESEARCH &amp; PROFESSIONAL EXPERIENCE</w:t>
       </w:r>
@@ -52,17 +52,17 @@
         <w:tblLook w:firstColumn="1" w:firstRow="1" w:lastColumn="0" w:lastRow="0" w:noHBand="0" w:noVBand="1" w:val="04A0"/>
       </w:tblPr>
       <w:tblGrid>
-        <w:gridCol w:w="5429"/>
-        <w:gridCol w:w="5429"/>
+        <w:gridCol w:w="5285"/>
+        <w:gridCol w:w="5285"/>
       </w:tblGrid>
       <w:tr>
         <w:tc>
           <w:tcPr>
-            <w:tcW w:type="dxa" w:w="5429"/>
+            <w:tcW w:type="dxa" w:w="5285"/>
           </w:tcPr>
           <w:p>
             <w:pPr>
-              <w:spacing w:after="0"/>
+              <w:spacing w:after="20" w:line="230" w:lineRule="exact"/>
             </w:pPr>
             <w:r>
               <w:rPr>
@@ -70,17 +70,17 @@
                 <w:b/>
                 <w:sz w:val="18"/>
               </w:rPr>
-              <w:t>Undergraduate Researcher, MIT Computer Vision Group</w:t>
+              <w:t>Undergraduate Researcher, He Vision Group</w:t>
             </w:r>
           </w:p>
         </w:tc>
         <w:tc>
           <w:tcPr>
-            <w:tcW w:type="dxa" w:w="5429"/>
+            <w:tcW w:type="dxa" w:w="5285"/>
           </w:tcPr>
           <w:p>
             <w:pPr>
-              <w:spacing w:after="0"/>
+              <w:spacing w:after="20" w:line="230" w:lineRule="exact"/>
               <w:jc w:val="right"/>
             </w:pPr>
             <w:r>
@@ -88,7 +88,7 @@
                 <w:rFonts w:ascii="Arial" w:hAnsi="Arial"/>
                 <w:b w:val="0"/>
                 <w:color w:val="45515C"/>
-                <w:sz w:val="16"/>
+                <w:sz w:val="17"/>
               </w:rPr>
               <w:t>Sep 2024 - Present</w:t>
             </w:r>
@@ -98,14 +98,14 @@
     </w:tbl>
     <w:p>
       <w:pPr>
-        <w:spacing w:after="0"/>
+        <w:spacing w:after="40" w:line="216" w:lineRule="exact"/>
       </w:pPr>
       <w:r>
         <w:rPr>
           <w:rFonts w:ascii="Arial" w:hAnsi="Arial"/>
           <w:b w:val="0"/>
           <w:color w:val="45515C"/>
-          <w:sz w:val="16"/>
+          <w:sz w:val="17"/>
         </w:rPr>
         <w:t>Professor: Kaiming He</w:t>
       </w:r>
@@ -113,29 +113,29 @@
     <w:p>
       <w:pPr>
         <w:pStyle w:val="ListBullet"/>
-        <w:spacing w:after="0"/>
+        <w:spacing w:after="40" w:line="216" w:lineRule="exact"/>
         <w:ind w:left="259" w:hanging="144"/>
       </w:pPr>
       <w:r>
         <w:rPr>
           <w:rFonts w:ascii="Arial" w:hAnsi="Arial"/>
           <w:b w:val="0"/>
-          <w:sz w:val="16"/>
+          <w:sz w:val="17"/>
         </w:rPr>
-        <w:t>Work as a UROP student in Prof. Kaiming He's computer vision group on generative models, including diffusion and flow matching, normalizing flows, and fast image generation.</w:t>
+        <w:t>Work as a UROP student in He Vision Group on generative models, including diffusion and flow matching, normalizing flows, and fast image generation.</w:t>
       </w:r>
     </w:p>
     <w:p>
       <w:pPr>
         <w:pStyle w:val="ListBullet"/>
-        <w:spacing w:after="0"/>
+        <w:spacing w:after="40" w:line="216" w:lineRule="exact"/>
         <w:ind w:left="259" w:hanging="144"/>
       </w:pPr>
       <w:r>
         <w:rPr>
           <w:rFonts w:ascii="Arial" w:hAnsi="Arial"/>
           <w:b w:val="0"/>
-          <w:sz w:val="16"/>
+          <w:sz w:val="17"/>
         </w:rPr>
         <w:t>Collaborate with Hanhong Zhao, Zhicheng Jiang, Xianbang Wang, and Yiyang Lu on a unified direction for vision-language understanding and text-to-image generation.</w:t>
       </w:r>
@@ -143,16 +143,31 @@
     <w:p>
       <w:pPr>
         <w:pStyle w:val="ListBullet"/>
-        <w:spacing w:after="0"/>
+        <w:spacing w:after="40" w:line="216" w:lineRule="exact"/>
         <w:ind w:left="259" w:hanging="144"/>
       </w:pPr>
       <w:r>
         <w:rPr>
           <w:rFonts w:ascii="Arial" w:hAnsi="Arial"/>
           <w:b w:val="0"/>
-          <w:sz w:val="16"/>
+          <w:sz w:val="17"/>
         </w:rPr>
         <w:t>Conduct large-scale experiments with JAX on TPUs and PyTorch on GPUs; build training, evaluation, and ablation pipelines for image generation models.</w:t>
+      </w:r>
+    </w:p>
+    <w:p>
+      <w:pPr>
+        <w:pStyle w:val="ListBullet"/>
+        <w:spacing w:after="40" w:line="216" w:lineRule="exact"/>
+        <w:ind w:left="259" w:hanging="144"/>
+      </w:pPr>
+      <w:r>
+        <w:rPr>
+          <w:rFonts w:ascii="Arial" w:hAnsi="Arial"/>
+          <w:b w:val="0"/>
+          <w:sz w:val="17"/>
+        </w:rPr>
+        <w:t>Serve as one of the group leads and TPU/GCP managers/admins, helping coordinate compute resources, access, and shared training infrastructure.</w:t>
       </w:r>
     </w:p>
     <w:tbl>
@@ -162,17 +177,17 @@
         <w:tblLook w:firstColumn="1" w:firstRow="1" w:lastColumn="0" w:lastRow="0" w:noHBand="0" w:noVBand="1" w:val="04A0"/>
       </w:tblPr>
       <w:tblGrid>
-        <w:gridCol w:w="5429"/>
-        <w:gridCol w:w="5429"/>
+        <w:gridCol w:w="5285"/>
+        <w:gridCol w:w="5285"/>
       </w:tblGrid>
       <w:tr>
         <w:tc>
           <w:tcPr>
-            <w:tcW w:type="dxa" w:w="5429"/>
+            <w:tcW w:type="dxa" w:w="5285"/>
           </w:tcPr>
           <w:p>
             <w:pPr>
-              <w:spacing w:after="0"/>
+              <w:spacing w:after="20" w:line="230" w:lineRule="exact"/>
             </w:pPr>
             <w:r>
               <w:rPr>
@@ -186,11 +201,11 @@
         </w:tc>
         <w:tc>
           <w:tcPr>
-            <w:tcW w:type="dxa" w:w="5429"/>
+            <w:tcW w:type="dxa" w:w="5285"/>
           </w:tcPr>
           <w:p>
             <w:pPr>
-              <w:spacing w:after="0"/>
+              <w:spacing w:after="20" w:line="230" w:lineRule="exact"/>
               <w:jc w:val="right"/>
             </w:pPr>
             <w:r>
@@ -198,7 +213,7 @@
                 <w:rFonts w:ascii="Arial" w:hAnsi="Arial"/>
                 <w:b w:val="0"/>
                 <w:color w:val="45515C"/>
-                <w:sz w:val="16"/>
+                <w:sz w:val="17"/>
               </w:rPr>
               <w:t>Jun 20 - Aug 31, 2025</w:t>
             </w:r>
@@ -208,14 +223,14 @@
     </w:tbl>
     <w:p>
       <w:pPr>
-        <w:spacing w:after="0"/>
+        <w:spacing w:after="40" w:line="216" w:lineRule="exact"/>
       </w:pPr>
       <w:r>
         <w:rPr>
           <w:rFonts w:ascii="Arial" w:hAnsi="Arial"/>
           <w:b w:val="0"/>
           <w:color w:val="45515C"/>
-          <w:sz w:val="16"/>
+          <w:sz w:val="17"/>
         </w:rPr>
         <w:t>Quantitative research and strategy analysis</w:t>
       </w:r>
@@ -223,14 +238,14 @@
     <w:p>
       <w:pPr>
         <w:pStyle w:val="ListBullet"/>
-        <w:spacing w:after="0"/>
+        <w:spacing w:after="40" w:line="216" w:lineRule="exact"/>
         <w:ind w:left="259" w:hanging="144"/>
       </w:pPr>
       <w:r>
         <w:rPr>
           <w:rFonts w:ascii="Arial" w:hAnsi="Arial"/>
           <w:b w:val="0"/>
-          <w:sz w:val="16"/>
+          <w:sz w:val="17"/>
         </w:rPr>
         <w:t>Researched quantitative strategy ideas and backtesting workflows with Python-based data analysis.</w:t>
       </w:r>
@@ -238,14 +253,14 @@
     <w:p>
       <w:pPr>
         <w:pStyle w:val="ListBullet"/>
-        <w:spacing w:after="0"/>
+        <w:spacing w:after="40" w:line="216" w:lineRule="exact"/>
         <w:ind w:left="259" w:hanging="144"/>
       </w:pPr>
       <w:r>
         <w:rPr>
           <w:rFonts w:ascii="Arial" w:hAnsi="Arial"/>
           <w:b w:val="0"/>
-          <w:sz w:val="16"/>
+          <w:sz w:val="17"/>
         </w:rPr>
         <w:t>Evaluated factor robustness, risk and turnover characteristics, and strategy diagnostics through statistical tests and visualization.</w:t>
       </w:r>
@@ -253,30 +268,30 @@
     <w:p>
       <w:pPr>
         <w:pStyle w:val="ListBullet"/>
-        <w:spacing w:after="0"/>
+        <w:spacing w:after="40" w:line="216" w:lineRule="exact"/>
         <w:ind w:left="259" w:hanging="144"/>
       </w:pPr>
       <w:r>
         <w:rPr>
           <w:rFonts w:ascii="Arial" w:hAnsi="Arial"/>
           <w:b w:val="0"/>
-          <w:sz w:val="16"/>
+          <w:sz w:val="17"/>
         </w:rPr>
         <w:t>Built reproducible research utilities for experiment tracking, factor validation, and portfolio-performance analysis.</w:t>
       </w:r>
     </w:p>
     <w:p>
       <w:pPr>
-        <w:spacing w:before="140" w:after="20"/>
+        <w:spacing w:before="220" w:after="60" w:line="240" w:lineRule="exact"/>
       </w:pPr>
       <w:r>
         <w:rPr>
           <w:rFonts w:ascii="Arial" w:hAnsi="Arial"/>
           <w:b/>
           <w:color w:val="1F4E79"/>
-          <w:sz w:val="19"/>
+          <w:sz w:val="20"/>
         </w:rPr>
-        <w:t>SELECTED RESEARCH PROJECTS</w:t>
+        <w:t>SELECTED PAPERS</w:t>
       </w:r>
     </w:p>
     <w:tbl>
@@ -286,17 +301,17 @@
         <w:tblLook w:firstColumn="1" w:firstRow="1" w:lastColumn="0" w:lastRow="0" w:noHBand="0" w:noVBand="1" w:val="04A0"/>
       </w:tblPr>
       <w:tblGrid>
-        <w:gridCol w:w="5429"/>
-        <w:gridCol w:w="5429"/>
+        <w:gridCol w:w="5285"/>
+        <w:gridCol w:w="5285"/>
       </w:tblGrid>
       <w:tr>
         <w:tc>
           <w:tcPr>
-            <w:tcW w:type="dxa" w:w="5429"/>
+            <w:tcW w:type="dxa" w:w="5285"/>
           </w:tcPr>
           <w:p>
             <w:pPr>
-              <w:spacing w:after="0"/>
+              <w:spacing w:after="20" w:line="230" w:lineRule="exact"/>
             </w:pPr>
             <w:r>
               <w:rPr>
@@ -310,11 +325,11 @@
         </w:tc>
         <w:tc>
           <w:tcPr>
-            <w:tcW w:type="dxa" w:w="5429"/>
+            <w:tcW w:type="dxa" w:w="5285"/>
           </w:tcPr>
           <w:p>
             <w:pPr>
-              <w:spacing w:after="0"/>
+              <w:spacing w:after="20" w:line="230" w:lineRule="exact"/>
               <w:jc w:val="right"/>
             </w:pPr>
             <w:r>
@@ -322,7 +337,7 @@
                 <w:rFonts w:ascii="Arial" w:hAnsi="Arial"/>
                 <w:b w:val="0"/>
                 <w:color w:val="45515C"/>
-                <w:sz w:val="16"/>
+                <w:sz w:val="17"/>
               </w:rPr>
               <w:t>2025</w:t>
             </w:r>
@@ -332,14 +347,14 @@
     </w:tbl>
     <w:p>
       <w:pPr>
-        <w:spacing w:after="0"/>
+        <w:spacing w:after="40" w:line="216" w:lineRule="exact"/>
       </w:pPr>
       <w:r>
         <w:rPr>
           <w:rFonts w:ascii="Arial" w:hAnsi="Arial"/>
           <w:b w:val="0"/>
           <w:color w:val="45515C"/>
-          <w:sz w:val="16"/>
+          <w:sz w:val="17"/>
         </w:rPr>
         <w:t>ICML 2025 poster; first author</w:t>
       </w:r>
@@ -347,14 +362,14 @@
     <w:p>
       <w:pPr>
         <w:pStyle w:val="ListBullet"/>
-        <w:spacing w:after="0"/>
+        <w:spacing w:after="40" w:line="216" w:lineRule="exact"/>
         <w:ind w:left="259" w:hanging="144"/>
       </w:pPr>
       <w:r>
         <w:rPr>
           <w:rFonts w:ascii="Arial" w:hAnsi="Arial"/>
           <w:b w:val="0"/>
-          <w:sz w:val="16"/>
+          <w:sz w:val="17"/>
         </w:rPr>
         <w:t>Revisited the necessity of noise conditioning in diffusion and flow-matching models by reimplementing eight denoising generative models across multiple datasets.</w:t>
       </w:r>
@@ -362,14 +377,14 @@
     <w:p>
       <w:pPr>
         <w:pStyle w:val="ListBullet"/>
-        <w:spacing w:after="0"/>
+        <w:spacing w:after="40" w:line="216" w:lineRule="exact"/>
         <w:ind w:left="259" w:hanging="144"/>
       </w:pPr>
       <w:r>
         <w:rPr>
           <w:rFonts w:ascii="Arial" w:hAnsi="Arial"/>
           <w:b w:val="0"/>
-          <w:sz w:val="16"/>
+          <w:sz w:val="17"/>
         </w:rPr>
         <w:t>Proposed uEDM, a noise-unconditional diffusion model with competitive performance, supported by theory that matches empirical behavior.</w:t>
       </w:r>
@@ -381,17 +396,17 @@
         <w:tblLook w:firstColumn="1" w:firstRow="1" w:lastColumn="0" w:lastRow="0" w:noHBand="0" w:noVBand="1" w:val="04A0"/>
       </w:tblPr>
       <w:tblGrid>
-        <w:gridCol w:w="5429"/>
-        <w:gridCol w:w="5429"/>
+        <w:gridCol w:w="5285"/>
+        <w:gridCol w:w="5285"/>
       </w:tblGrid>
       <w:tr>
         <w:tc>
           <w:tcPr>
-            <w:tcW w:type="dxa" w:w="5429"/>
+            <w:tcW w:type="dxa" w:w="5285"/>
           </w:tcPr>
           <w:p>
             <w:pPr>
-              <w:spacing w:after="0"/>
+              <w:spacing w:after="20" w:line="230" w:lineRule="exact"/>
             </w:pPr>
             <w:r>
               <w:rPr>
@@ -405,11 +420,11 @@
         </w:tc>
         <w:tc>
           <w:tcPr>
-            <w:tcW w:type="dxa" w:w="5429"/>
+            <w:tcW w:type="dxa" w:w="5285"/>
           </w:tcPr>
           <w:p>
             <w:pPr>
-              <w:spacing w:after="0"/>
+              <w:spacing w:after="20" w:line="230" w:lineRule="exact"/>
               <w:jc w:val="right"/>
             </w:pPr>
             <w:r>
@@ -417,7 +432,7 @@
                 <w:rFonts w:ascii="Arial" w:hAnsi="Arial"/>
                 <w:b w:val="0"/>
                 <w:color w:val="45515C"/>
-                <w:sz w:val="16"/>
+                <w:sz w:val="17"/>
               </w:rPr>
               <w:t>2025</w:t>
             </w:r>
@@ -427,14 +442,14 @@
     </w:tbl>
     <w:p>
       <w:pPr>
-        <w:spacing w:after="0"/>
+        <w:spacing w:after="40" w:line="216" w:lineRule="exact"/>
       </w:pPr>
       <w:r>
         <w:rPr>
           <w:rFonts w:ascii="Arial" w:hAnsi="Arial"/>
           <w:b w:val="0"/>
           <w:color w:val="45515C"/>
-          <w:sz w:val="16"/>
+          <w:sz w:val="17"/>
         </w:rPr>
         <w:t>Project lead and first author</w:t>
       </w:r>
@@ -442,14 +457,14 @@
     <w:p>
       <w:pPr>
         <w:pStyle w:val="ListBullet"/>
-        <w:spacing w:after="0"/>
+        <w:spacing w:after="40" w:line="216" w:lineRule="exact"/>
         <w:ind w:left="259" w:hanging="144"/>
       </w:pPr>
       <w:r>
         <w:rPr>
           <w:rFonts w:ascii="Arial" w:hAnsi="Arial"/>
           <w:b w:val="0"/>
-          <w:sz w:val="16"/>
+          <w:sz w:val="17"/>
         </w:rPr>
         <w:t>Revisited normalizing flows with a learned reverse map, eliminating explicit inverse-flow computation and slow autoregressive inference.</w:t>
       </w:r>
@@ -457,14 +472,14 @@
     <w:p>
       <w:pPr>
         <w:pStyle w:val="ListBullet"/>
-        <w:spacing w:after="0"/>
+        <w:spacing w:after="40" w:line="216" w:lineRule="exact"/>
         <w:ind w:left="259" w:hanging="144"/>
       </w:pPr>
       <w:r>
         <w:rPr>
           <w:rFonts w:ascii="Arial" w:hAnsi="Arial"/>
           <w:b w:val="0"/>
-          <w:sz w:val="16"/>
+          <w:sz w:val="17"/>
         </w:rPr>
         <w:t>Guided reverse learning through hidden-state alignment, enabling single-evaluation NF-based generation with state-of-the-art results among NF methods.</w:t>
       </w:r>
@@ -476,17 +491,17 @@
         <w:tblLook w:firstColumn="1" w:firstRow="1" w:lastColumn="0" w:lastRow="0" w:noHBand="0" w:noVBand="1" w:val="04A0"/>
       </w:tblPr>
       <w:tblGrid>
-        <w:gridCol w:w="5429"/>
-        <w:gridCol w:w="5429"/>
+        <w:gridCol w:w="5285"/>
+        <w:gridCol w:w="5285"/>
       </w:tblGrid>
       <w:tr>
         <w:tc>
           <w:tcPr>
-            <w:tcW w:type="dxa" w:w="5429"/>
+            <w:tcW w:type="dxa" w:w="5285"/>
           </w:tcPr>
           <w:p>
             <w:pPr>
-              <w:spacing w:after="0"/>
+              <w:spacing w:after="20" w:line="230" w:lineRule="exact"/>
             </w:pPr>
             <w:r>
               <w:rPr>
@@ -500,11 +515,11 @@
         </w:tc>
         <w:tc>
           <w:tcPr>
-            <w:tcW w:type="dxa" w:w="5429"/>
+            <w:tcW w:type="dxa" w:w="5285"/>
           </w:tcPr>
           <w:p>
             <w:pPr>
-              <w:spacing w:after="0"/>
+              <w:spacing w:after="20" w:line="230" w:lineRule="exact"/>
               <w:jc w:val="right"/>
             </w:pPr>
             <w:r>
@@ -512,7 +527,7 @@
                 <w:rFonts w:ascii="Arial" w:hAnsi="Arial"/>
                 <w:b w:val="0"/>
                 <w:color w:val="45515C"/>
-                <w:sz w:val="16"/>
+                <w:sz w:val="17"/>
               </w:rPr>
               <w:t>2026</w:t>
             </w:r>
@@ -522,14 +537,14 @@
     </w:tbl>
     <w:p>
       <w:pPr>
-        <w:spacing w:after="0"/>
+        <w:spacing w:after="40" w:line="216" w:lineRule="exact"/>
       </w:pPr>
       <w:r>
         <w:rPr>
           <w:rFonts w:ascii="Arial" w:hAnsi="Arial"/>
           <w:b w:val="0"/>
           <w:color w:val="45515C"/>
-          <w:sz w:val="16"/>
+          <w:sz w:val="17"/>
         </w:rPr>
         <w:t>First author</w:t>
       </w:r>
@@ -537,14 +552,14 @@
     <w:p>
       <w:pPr>
         <w:pStyle w:val="ListBullet"/>
-        <w:spacing w:after="0"/>
+        <w:spacing w:after="40" w:line="216" w:lineRule="exact"/>
         <w:ind w:left="259" w:hanging="144"/>
       </w:pPr>
       <w:r>
         <w:rPr>
           <w:rFonts w:ascii="Arial" w:hAnsi="Arial"/>
           <w:b w:val="0"/>
-          <w:sz w:val="16"/>
+          <w:sz w:val="17"/>
         </w:rPr>
         <w:t>Built a strong baseline for one-step, pixel-space, latent-free generation using MeanFlow with x-prediction.</w:t>
       </w:r>
@@ -552,16 +567,30 @@
     <w:p>
       <w:pPr>
         <w:pStyle w:val="ListBullet"/>
-        <w:spacing w:after="0"/>
+        <w:spacing w:after="40" w:line="216" w:lineRule="exact"/>
         <w:ind w:left="259" w:hanging="144"/>
       </w:pPr>
       <w:r>
         <w:rPr>
           <w:rFonts w:ascii="Arial" w:hAnsi="Arial"/>
           <w:b w:val="0"/>
-          <w:sz w:val="16"/>
+          <w:sz w:val="17"/>
         </w:rPr>
         <w:t>Reported 2.22 FID on ImageNet 256 and 2.48 FID on ImageNet 512; open-source implementation at Lyy-iiis/pMF.</w:t>
+      </w:r>
+    </w:p>
+    <w:p>
+      <w:pPr>
+        <w:spacing w:before="220" w:after="60" w:line="240" w:lineRule="exact"/>
+      </w:pPr>
+      <w:r>
+        <w:rPr>
+          <w:rFonts w:ascii="Arial" w:hAnsi="Arial"/>
+          <w:b/>
+          <w:color w:val="1F4E79"/>
+          <w:sz w:val="20"/>
+        </w:rPr>
+        <w:t>COURSE PROJECTS</w:t>
       </w:r>
     </w:p>
     <w:tbl>
@@ -571,17 +600,17 @@
         <w:tblLook w:firstColumn="1" w:firstRow="1" w:lastColumn="0" w:lastRow="0" w:noHBand="0" w:noVBand="1" w:val="04A0"/>
       </w:tblPr>
       <w:tblGrid>
-        <w:gridCol w:w="5429"/>
-        <w:gridCol w:w="5429"/>
+        <w:gridCol w:w="5285"/>
+        <w:gridCol w:w="5285"/>
       </w:tblGrid>
       <w:tr>
         <w:tc>
           <w:tcPr>
-            <w:tcW w:type="dxa" w:w="5429"/>
+            <w:tcW w:type="dxa" w:w="5285"/>
           </w:tcPr>
           <w:p>
             <w:pPr>
-              <w:spacing w:after="0"/>
+              <w:spacing w:after="20" w:line="230" w:lineRule="exact"/>
             </w:pPr>
             <w:r>
               <w:rPr>
@@ -595,11 +624,11 @@
         </w:tc>
         <w:tc>
           <w:tcPr>
-            <w:tcW w:type="dxa" w:w="5429"/>
+            <w:tcW w:type="dxa" w:w="5285"/>
           </w:tcPr>
           <w:p>
             <w:pPr>
-              <w:spacing w:after="0"/>
+              <w:spacing w:after="20" w:line="230" w:lineRule="exact"/>
               <w:jc w:val="right"/>
             </w:pPr>
             <w:r>
@@ -607,7 +636,7 @@
                 <w:rFonts w:ascii="Arial" w:hAnsi="Arial"/>
                 <w:b w:val="0"/>
                 <w:color w:val="45515C"/>
-                <w:sz w:val="16"/>
+                <w:sz w:val="17"/>
               </w:rPr>
               <w:t>2025</w:t>
             </w:r>
@@ -617,14 +646,14 @@
     </w:tbl>
     <w:p>
       <w:pPr>
-        <w:spacing w:after="0"/>
+        <w:spacing w:after="40" w:line="216" w:lineRule="exact"/>
       </w:pPr>
       <w:r>
         <w:rPr>
           <w:rFonts w:ascii="Arial" w:hAnsi="Arial"/>
           <w:b w:val="0"/>
           <w:color w:val="45515C"/>
-          <w:sz w:val="16"/>
+          <w:sz w:val="17"/>
         </w:rPr>
         <w:t>MIT 6.4210 course project; robotics manipulation</w:t>
       </w:r>
@@ -632,14 +661,14 @@
     <w:p>
       <w:pPr>
         <w:pStyle w:val="ListBullet"/>
-        <w:spacing w:after="0"/>
+        <w:spacing w:after="40" w:line="216" w:lineRule="exact"/>
         <w:ind w:left="259" w:hanging="144"/>
       </w:pPr>
       <w:r>
         <w:rPr>
           <w:rFonts w:ascii="Arial" w:hAnsi="Arial"/>
           <w:b w:val="0"/>
-          <w:sz w:val="16"/>
+          <w:sz w:val="17"/>
         </w:rPr>
         <w:t>Reimplemented a BeyondMimic-style humanoid loco-manipulation pipeline with simulated data preparation, diffusion training, and post-hoc control guidance.</w:t>
       </w:r>
@@ -647,28 +676,28 @@
     <w:p>
       <w:pPr>
         <w:pStyle w:val="ListBullet"/>
-        <w:spacing w:after="0"/>
+        <w:spacing w:after="40" w:line="216" w:lineRule="exact"/>
         <w:ind w:left="259" w:hanging="144"/>
       </w:pPr>
       <w:r>
         <w:rPr>
           <w:rFonts w:ascii="Arial" w:hAnsi="Arial"/>
           <w:b w:val="0"/>
-          <w:sz w:val="16"/>
+          <w:sz w:val="17"/>
         </w:rPr>
         <w:t>Replaced DDPM sampling with flow matching and demonstrated lower-latency control with 5 sampling steps.</w:t>
       </w:r>
     </w:p>
     <w:p>
       <w:pPr>
-        <w:spacing w:before="140" w:after="20"/>
+        <w:spacing w:before="220" w:after="60" w:line="240" w:lineRule="exact"/>
       </w:pPr>
       <w:r>
         <w:rPr>
           <w:rFonts w:ascii="Arial" w:hAnsi="Arial"/>
           <w:b/>
           <w:color w:val="1F4E79"/>
-          <w:sz w:val="19"/>
+          <w:sz w:val="20"/>
         </w:rPr>
         <w:t>EDUCATION</w:t>
       </w:r>
@@ -680,17 +709,17 @@
         <w:tblLook w:firstColumn="1" w:firstRow="1" w:lastColumn="0" w:lastRow="0" w:noHBand="0" w:noVBand="1" w:val="04A0"/>
       </w:tblPr>
       <w:tblGrid>
-        <w:gridCol w:w="5429"/>
-        <w:gridCol w:w="5429"/>
+        <w:gridCol w:w="5285"/>
+        <w:gridCol w:w="5285"/>
       </w:tblGrid>
       <w:tr>
         <w:tc>
           <w:tcPr>
-            <w:tcW w:type="dxa" w:w="5429"/>
+            <w:tcW w:type="dxa" w:w="5285"/>
           </w:tcPr>
           <w:p>
             <w:pPr>
-              <w:spacing w:after="0"/>
+              <w:spacing w:after="20" w:line="230" w:lineRule="exact"/>
             </w:pPr>
             <w:r>
               <w:rPr>
@@ -704,11 +733,11 @@
         </w:tc>
         <w:tc>
           <w:tcPr>
-            <w:tcW w:type="dxa" w:w="5429"/>
+            <w:tcW w:type="dxa" w:w="5285"/>
           </w:tcPr>
           <w:p>
             <w:pPr>
-              <w:spacing w:after="0"/>
+              <w:spacing w:after="20" w:line="230" w:lineRule="exact"/>
               <w:jc w:val="right"/>
             </w:pPr>
             <w:r>
@@ -716,7 +745,7 @@
                 <w:rFonts w:ascii="Arial" w:hAnsi="Arial"/>
                 <w:b w:val="0"/>
                 <w:color w:val="45515C"/>
-                <w:sz w:val="16"/>
+                <w:sz w:val="17"/>
               </w:rPr>
               <w:t>Sep 2024 - Present</w:t>
             </w:r>
@@ -726,14 +755,14 @@
     </w:tbl>
     <w:p>
       <w:pPr>
-        <w:spacing w:after="0"/>
+        <w:spacing w:after="40" w:line="216" w:lineRule="exact"/>
       </w:pPr>
       <w:r>
         <w:rPr>
           <w:rFonts w:ascii="Arial" w:hAnsi="Arial"/>
           <w:b w:val="0"/>
           <w:color w:val="45515C"/>
-          <w:sz w:val="16"/>
+          <w:sz w:val="17"/>
         </w:rPr>
         <w:t>Undergraduate in Artificial Intelligence and Mathematics; expected graduation: 2028; GPA: 5.00/5.00</w:t>
       </w:r>
@@ -745,17 +774,17 @@
         <w:tblLook w:firstColumn="1" w:firstRow="1" w:lastColumn="0" w:lastRow="0" w:noHBand="0" w:noVBand="1" w:val="04A0"/>
       </w:tblPr>
       <w:tblGrid>
-        <w:gridCol w:w="5429"/>
-        <w:gridCol w:w="5429"/>
+        <w:gridCol w:w="5285"/>
+        <w:gridCol w:w="5285"/>
       </w:tblGrid>
       <w:tr>
         <w:tc>
           <w:tcPr>
-            <w:tcW w:type="dxa" w:w="5429"/>
+            <w:tcW w:type="dxa" w:w="5285"/>
           </w:tcPr>
           <w:p>
             <w:pPr>
-              <w:spacing w:after="0"/>
+              <w:spacing w:after="20" w:line="230" w:lineRule="exact"/>
             </w:pPr>
             <w:r>
               <w:rPr>
@@ -769,11 +798,11 @@
         </w:tc>
         <w:tc>
           <w:tcPr>
-            <w:tcW w:type="dxa" w:w="5429"/>
+            <w:tcW w:type="dxa" w:w="5285"/>
           </w:tcPr>
           <w:p>
             <w:pPr>
-              <w:spacing w:after="0"/>
+              <w:spacing w:after="20" w:line="230" w:lineRule="exact"/>
               <w:jc w:val="right"/>
             </w:pPr>
             <w:r>
@@ -781,7 +810,7 @@
                 <w:rFonts w:ascii="Arial" w:hAnsi="Arial"/>
                 <w:b w:val="0"/>
                 <w:color w:val="45515C"/>
-                <w:sz w:val="16"/>
+                <w:sz w:val="17"/>
               </w:rPr>
               <w:t>Sep 2023 - Jul 2024</w:t>
             </w:r>
@@ -791,28 +820,33 @@
     </w:tbl>
     <w:p>
       <w:pPr>
-        <w:spacing w:after="0"/>
+        <w:spacing w:after="40" w:line="216" w:lineRule="exact"/>
       </w:pPr>
       <w:r>
         <w:rPr>
           <w:rFonts w:ascii="Arial" w:hAnsi="Arial"/>
           <w:b w:val="0"/>
           <w:color w:val="45515C"/>
-          <w:sz w:val="16"/>
+          <w:sz w:val="17"/>
         </w:rPr>
         <w:t>Pre-college student; GPA: 4.00/4.00</w:t>
       </w:r>
     </w:p>
     <w:p>
+      <w:r>
+        <w:br w:type="page"/>
+      </w:r>
+    </w:p>
+    <w:p>
       <w:pPr>
-        <w:spacing w:before="140" w:after="20"/>
+        <w:spacing w:before="220" w:after="60" w:line="240" w:lineRule="exact"/>
       </w:pPr>
       <w:r>
         <w:rPr>
           <w:rFonts w:ascii="Arial" w:hAnsi="Arial"/>
           <w:b/>
           <w:color w:val="1F4E79"/>
-          <w:sz w:val="19"/>
+          <w:sz w:val="20"/>
         </w:rPr>
         <w:t>CERTIFICATES &amp; HONORS</w:t>
       </w:r>
@@ -824,17 +858,17 @@
         <w:tblLook w:firstColumn="1" w:firstRow="1" w:lastColumn="0" w:lastRow="0" w:noHBand="0" w:noVBand="1" w:val="04A0"/>
       </w:tblPr>
       <w:tblGrid>
-        <w:gridCol w:w="5429"/>
-        <w:gridCol w:w="5429"/>
+        <w:gridCol w:w="5285"/>
+        <w:gridCol w:w="5285"/>
       </w:tblGrid>
       <w:tr>
         <w:tc>
           <w:tcPr>
-            <w:tcW w:type="dxa" w:w="5429"/>
+            <w:tcW w:type="dxa" w:w="5285"/>
           </w:tcPr>
           <w:p>
             <w:pPr>
-              <w:spacing w:after="0"/>
+              <w:spacing w:after="20" w:line="230" w:lineRule="exact"/>
             </w:pPr>
             <w:r>
               <w:rPr>
@@ -848,11 +882,11 @@
         </w:tc>
         <w:tc>
           <w:tcPr>
-            <w:tcW w:type="dxa" w:w="5429"/>
+            <w:tcW w:type="dxa" w:w="5285"/>
           </w:tcPr>
           <w:p>
             <w:pPr>
-              <w:spacing w:after="0"/>
+              <w:spacing w:after="20" w:line="230" w:lineRule="exact"/>
               <w:jc w:val="right"/>
             </w:pPr>
             <w:r>
@@ -860,7 +894,7 @@
                 <w:rFonts w:ascii="Arial" w:hAnsi="Arial"/>
                 <w:b w:val="0"/>
                 <w:color w:val="45515C"/>
-                <w:sz w:val="16"/>
+                <w:sz w:val="17"/>
               </w:rPr>
               <w:t>2024</w:t>
             </w:r>
@@ -875,17 +909,17 @@
         <w:tblLook w:firstColumn="1" w:firstRow="1" w:lastColumn="0" w:lastRow="0" w:noHBand="0" w:noVBand="1" w:val="04A0"/>
       </w:tblPr>
       <w:tblGrid>
-        <w:gridCol w:w="5429"/>
-        <w:gridCol w:w="5429"/>
+        <w:gridCol w:w="5285"/>
+        <w:gridCol w:w="5285"/>
       </w:tblGrid>
       <w:tr>
         <w:tc>
           <w:tcPr>
-            <w:tcW w:type="dxa" w:w="5429"/>
+            <w:tcW w:type="dxa" w:w="5285"/>
           </w:tcPr>
           <w:p>
             <w:pPr>
-              <w:spacing w:after="0"/>
+              <w:spacing w:after="20" w:line="230" w:lineRule="exact"/>
             </w:pPr>
             <w:r>
               <w:rPr>
@@ -899,11 +933,11 @@
         </w:tc>
         <w:tc>
           <w:tcPr>
-            <w:tcW w:type="dxa" w:w="5429"/>
+            <w:tcW w:type="dxa" w:w="5285"/>
           </w:tcPr>
           <w:p>
             <w:pPr>
-              <w:spacing w:after="0"/>
+              <w:spacing w:after="20" w:line="230" w:lineRule="exact"/>
               <w:jc w:val="right"/>
             </w:pPr>
             <w:r>
@@ -911,7 +945,7 @@
                 <w:rFonts w:ascii="Arial" w:hAnsi="Arial"/>
                 <w:b w:val="0"/>
                 <w:color w:val="45515C"/>
-                <w:sz w:val="16"/>
+                <w:sz w:val="17"/>
               </w:rPr>
               <w:t>2023</w:t>
             </w:r>
@@ -926,17 +960,17 @@
         <w:tblLook w:firstColumn="1" w:firstRow="1" w:lastColumn="0" w:lastRow="0" w:noHBand="0" w:noVBand="1" w:val="04A0"/>
       </w:tblPr>
       <w:tblGrid>
-        <w:gridCol w:w="5429"/>
-        <w:gridCol w:w="5429"/>
+        <w:gridCol w:w="5285"/>
+        <w:gridCol w:w="5285"/>
       </w:tblGrid>
       <w:tr>
         <w:tc>
           <w:tcPr>
-            <w:tcW w:type="dxa" w:w="5429"/>
+            <w:tcW w:type="dxa" w:w="5285"/>
           </w:tcPr>
           <w:p>
             <w:pPr>
-              <w:spacing w:after="0"/>
+              <w:spacing w:after="20" w:line="230" w:lineRule="exact"/>
             </w:pPr>
             <w:r>
               <w:rPr>
@@ -950,11 +984,11 @@
         </w:tc>
         <w:tc>
           <w:tcPr>
-            <w:tcW w:type="dxa" w:w="5429"/>
+            <w:tcW w:type="dxa" w:w="5285"/>
           </w:tcPr>
           <w:p>
             <w:pPr>
-              <w:spacing w:after="0"/>
+              <w:spacing w:after="20" w:line="230" w:lineRule="exact"/>
               <w:jc w:val="right"/>
             </w:pPr>
             <w:r>
@@ -962,7 +996,7 @@
                 <w:rFonts w:ascii="Arial" w:hAnsi="Arial"/>
                 <w:b w:val="0"/>
                 <w:color w:val="45515C"/>
-                <w:sz w:val="16"/>
+                <w:sz w:val="17"/>
               </w:rPr>
               <w:t>2022</w:t>
             </w:r>
@@ -977,17 +1011,17 @@
         <w:tblLook w:firstColumn="1" w:firstRow="1" w:lastColumn="0" w:lastRow="0" w:noHBand="0" w:noVBand="1" w:val="04A0"/>
       </w:tblPr>
       <w:tblGrid>
-        <w:gridCol w:w="5429"/>
-        <w:gridCol w:w="5429"/>
+        <w:gridCol w:w="5285"/>
+        <w:gridCol w:w="5285"/>
       </w:tblGrid>
       <w:tr>
         <w:tc>
           <w:tcPr>
-            <w:tcW w:type="dxa" w:w="5429"/>
+            <w:tcW w:type="dxa" w:w="5285"/>
           </w:tcPr>
           <w:p>
             <w:pPr>
-              <w:spacing w:after="0"/>
+              <w:spacing w:after="20" w:line="230" w:lineRule="exact"/>
             </w:pPr>
             <w:r>
               <w:rPr>
@@ -1001,11 +1035,11 @@
         </w:tc>
         <w:tc>
           <w:tcPr>
-            <w:tcW w:type="dxa" w:w="5429"/>
+            <w:tcW w:type="dxa" w:w="5285"/>
           </w:tcPr>
           <w:p>
             <w:pPr>
-              <w:spacing w:after="0"/>
+              <w:spacing w:after="20" w:line="230" w:lineRule="exact"/>
               <w:jc w:val="right"/>
             </w:pPr>
             <w:r>
@@ -1013,7 +1047,7 @@
                 <w:rFonts w:ascii="Arial" w:hAnsi="Arial"/>
                 <w:b w:val="0"/>
                 <w:color w:val="45515C"/>
-                <w:sz w:val="16"/>
+                <w:sz w:val="17"/>
               </w:rPr>
               <w:t>2022-2024</w:t>
             </w:r>
@@ -1023,14 +1057,14 @@
     </w:tbl>
     <w:p>
       <w:pPr>
-        <w:spacing w:before="140" w:after="20"/>
+        <w:spacing w:before="220" w:after="60" w:line="240" w:lineRule="exact"/>
       </w:pPr>
       <w:r>
         <w:rPr>
           <w:rFonts w:ascii="Arial" w:hAnsi="Arial"/>
           <w:b/>
           <w:color w:val="1F4E79"/>
-          <w:sz w:val="19"/>
+          <w:sz w:val="20"/>
         </w:rPr>
         <w:t>SKILLS</w:t>
       </w:r>
@@ -1042,17 +1076,17 @@
         <w:tblLook w:firstColumn="1" w:firstRow="1" w:lastColumn="0" w:lastRow="0" w:noHBand="0" w:noVBand="1" w:val="04A0"/>
       </w:tblPr>
       <w:tblGrid>
-        <w:gridCol w:w="5429"/>
-        <w:gridCol w:w="5429"/>
+        <w:gridCol w:w="5285"/>
+        <w:gridCol w:w="5285"/>
       </w:tblGrid>
       <w:tr>
         <w:tc>
           <w:tcPr>
-            <w:tcW w:type="dxa" w:w="5429"/>
+            <w:tcW w:type="dxa" w:w="5285"/>
           </w:tcPr>
           <w:p>
             <w:pPr>
-              <w:spacing w:after="0"/>
+              <w:spacing w:after="20" w:line="230" w:lineRule="exact"/>
             </w:pPr>
             <w:r>
               <w:rPr>
@@ -1066,11 +1100,11 @@
         </w:tc>
         <w:tc>
           <w:tcPr>
-            <w:tcW w:type="dxa" w:w="5429"/>
+            <w:tcW w:type="dxa" w:w="5285"/>
           </w:tcPr>
           <w:p>
             <w:pPr>
-              <w:spacing w:after="0"/>
+              <w:spacing w:after="20" w:line="230" w:lineRule="exact"/>
               <w:jc w:val="right"/>
             </w:pPr>
             <w:r>
@@ -1078,7 +1112,7 @@
                 <w:rFonts w:ascii="Arial" w:hAnsi="Arial"/>
                 <w:b w:val="0"/>
                 <w:color w:val="45515C"/>
-                <w:sz w:val="16"/>
+                <w:sz w:val="17"/>
               </w:rPr>
             </w:r>
           </w:p>
@@ -1087,14 +1121,14 @@
     </w:tbl>
     <w:p>
       <w:pPr>
-        <w:spacing w:after="0"/>
+        <w:spacing w:after="40" w:line="216" w:lineRule="exact"/>
       </w:pPr>
       <w:r>
         <w:rPr>
           <w:rFonts w:ascii="Arial" w:hAnsi="Arial"/>
           <w:b w:val="0"/>
           <w:color w:val="45515C"/>
-          <w:sz w:val="16"/>
+          <w:sz w:val="17"/>
         </w:rPr>
         <w:t>Python, C, PyTorch, JAX, GPU/TPU training and evaluation</w:t>
       </w:r>
@@ -1106,17 +1140,17 @@
         <w:tblLook w:firstColumn="1" w:firstRow="1" w:lastColumn="0" w:lastRow="0" w:noHBand="0" w:noVBand="1" w:val="04A0"/>
       </w:tblPr>
       <w:tblGrid>
-        <w:gridCol w:w="5429"/>
-        <w:gridCol w:w="5429"/>
+        <w:gridCol w:w="5285"/>
+        <w:gridCol w:w="5285"/>
       </w:tblGrid>
       <w:tr>
         <w:tc>
           <w:tcPr>
-            <w:tcW w:type="dxa" w:w="5429"/>
+            <w:tcW w:type="dxa" w:w="5285"/>
           </w:tcPr>
           <w:p>
             <w:pPr>
-              <w:spacing w:after="0"/>
+              <w:spacing w:after="20" w:line="230" w:lineRule="exact"/>
             </w:pPr>
             <w:r>
               <w:rPr>
@@ -1130,11 +1164,11 @@
         </w:tc>
         <w:tc>
           <w:tcPr>
-            <w:tcW w:type="dxa" w:w="5429"/>
+            <w:tcW w:type="dxa" w:w="5285"/>
           </w:tcPr>
           <w:p>
             <w:pPr>
-              <w:spacing w:after="0"/>
+              <w:spacing w:after="20" w:line="230" w:lineRule="exact"/>
               <w:jc w:val="right"/>
             </w:pPr>
             <w:r>
@@ -1142,7 +1176,7 @@
                 <w:rFonts w:ascii="Arial" w:hAnsi="Arial"/>
                 <w:b w:val="0"/>
                 <w:color w:val="45515C"/>
-                <w:sz w:val="16"/>
+                <w:sz w:val="17"/>
               </w:rPr>
             </w:r>
           </w:p>
@@ -1151,21 +1185,21 @@
     </w:tbl>
     <w:p>
       <w:pPr>
-        <w:spacing w:after="0"/>
+        <w:spacing w:after="40" w:line="216" w:lineRule="exact"/>
       </w:pPr>
       <w:r>
         <w:rPr>
           <w:rFonts w:ascii="Arial" w:hAnsi="Arial"/>
           <w:b w:val="0"/>
           <w:color w:val="45515C"/>
-          <w:sz w:val="16"/>
+          <w:sz w:val="17"/>
         </w:rPr>
         <w:t>Mandarin (native), English (fluent)</w:t>
       </w:r>
     </w:p>
     <w:sectPr>
       <w:pgSz w:w="12240" w:h="15840"/>
-      <w:pgMar w:top="605" w:right="691" w:bottom="648" w:left="691" w:header="720" w:footer="720" w:gutter="0"/>
+      <w:pgMar w:top="749" w:right="835" w:bottom="806" w:left="835" w:header="720" w:footer="720" w:gutter="0"/>
       <w:cols w:space="720"/>
       <w:docGrid w:linePitch="360"/>
     </w:sectPr>

</xml_diff>

<commit_message>
Add 2025 Putnam honor
</commit_message>
<xml_diff>
--- a/assets/pdf/Qiao-Sun-CV.docx
+++ b/assets/pdf/Qiao-Sun-CV.docx
@@ -876,6 +876,57 @@
                 <w:b/>
                 <w:sz w:val="18"/>
               </w:rPr>
+              <w:t>Top 17, 2025 Putnam Mathematical Competition</w:t>
+            </w:r>
+          </w:p>
+        </w:tc>
+        <w:tc>
+          <w:tcPr>
+            <w:tcW w:type="dxa" w:w="5285"/>
+          </w:tcPr>
+          <w:p>
+            <w:pPr>
+              <w:spacing w:after="20" w:line="230" w:lineRule="exact"/>
+              <w:jc w:val="right"/>
+            </w:pPr>
+            <w:r>
+              <w:rPr>
+                <w:rFonts w:ascii="Arial" w:hAnsi="Arial"/>
+                <w:b w:val="0"/>
+                <w:color w:val="45515C"/>
+                <w:sz w:val="17"/>
+              </w:rPr>
+              <w:t>2025</w:t>
+            </w:r>
+          </w:p>
+        </w:tc>
+      </w:tr>
+    </w:tbl>
+    <w:tbl>
+      <w:tblPr>
+        <w:tblW w:type="auto" w:w="0"/>
+        <w:tblLayout w:type="autofit"/>
+        <w:tblLook w:firstColumn="1" w:firstRow="1" w:lastColumn="0" w:lastRow="0" w:noHBand="0" w:noVBand="1" w:val="04A0"/>
+      </w:tblPr>
+      <w:tblGrid>
+        <w:gridCol w:w="5285"/>
+        <w:gridCol w:w="5285"/>
+      </w:tblGrid>
+      <w:tr>
+        <w:tc>
+          <w:tcPr>
+            <w:tcW w:type="dxa" w:w="5285"/>
+          </w:tcPr>
+          <w:p>
+            <w:pPr>
+              <w:spacing w:after="20" w:line="230" w:lineRule="exact"/>
+            </w:pPr>
+            <w:r>
+              <w:rPr>
+                <w:rFonts w:ascii="Arial" w:hAnsi="Arial"/>
+                <w:b/>
+                <w:sz w:val="18"/>
+              </w:rPr>
               <w:t>2nd place, 2024 Putnam Mathematical Competition</w:t>
             </w:r>
           </w:p>

</xml_diff>

<commit_message>
Add robotics project video link
</commit_message>
<xml_diff>
--- a/assets/pdf/Qiao-Sun-CV.docx
+++ b/assets/pdf/Qiao-Sun-CV.docx
@@ -656,6 +656,21 @@
           <w:sz w:val="17"/>
         </w:rPr>
         <w:t>MIT 6.4210 course project; robotics manipulation</w:t>
+      </w:r>
+    </w:p>
+    <w:p>
+      <w:pPr>
+        <w:pStyle w:val="ListBullet"/>
+        <w:spacing w:after="40" w:line="216" w:lineRule="exact"/>
+        <w:ind w:left="259" w:hanging="144"/>
+      </w:pPr>
+      <w:r>
+        <w:rPr>
+          <w:rFonts w:ascii="Arial" w:hAnsi="Arial"/>
+          <w:b w:val="0"/>
+          <w:sz w:val="17"/>
+        </w:rPr>
+        <w:t>Project video: https://www.youtube.com/watch?v=MIpTpM4C71k&amp;t=2s</w:t>
       </w:r>
     </w:p>
     <w:p>

</xml_diff>